<commit_message>
Update tez and poster
</commit_message>
<xml_diff>
--- a/tez/2026_tez.docx
+++ b/tez/2026_tez.docx
@@ -22656,7 +22656,7 @@
       </w:pPr>
       <w:r>
         <w:drawing>
-          <wp:inline distT="0" distB="0" distL="0" distR="0" wp14:anchorId="5C3B580A" wp14:editId="213D6450">
+          <wp:inline distT="0" distB="0" distL="0" distR="0" wp14:anchorId="5C3B580A" wp14:editId="0B3FFBF9">
             <wp:extent cx="4679950" cy="2887345"/>
             <wp:effectExtent l="0" t="0" r="6350" b="8255"/>
             <wp:docPr id="3" name="Picture 1"/>
@@ -24593,7 +24593,16 @@
         <w:shd w:val="clear" w:color="auto" w:fill="FFFFFF" w:themeFill="background1"/>
       </w:pPr>
       <w:r>
-        <w:t>python main.py            # grafiksel arayüz (GUI)</w:t>
+        <w:t>python main.py</w:t>
+      </w:r>
+      <w:r>
+        <w:tab/>
+      </w:r>
+      <w:r>
+        <w:tab/>
+      </w:r>
+      <w:r>
+        <w:t># grafiksel arayüz (GUI)</w:t>
       </w:r>
     </w:p>
     <w:p>
@@ -24601,10 +24610,22 @@
         <w:shd w:val="clear" w:color="auto" w:fill="FFFFFF" w:themeFill="background1"/>
       </w:pPr>
       <w:r>
-        <w:t xml:space="preserve">python main.py --cli    </w:t>
-      </w:r>
-      <w:r>
-        <w:t xml:space="preserve"> # terminal kipi (Ctrl+Q ile durdurulur)</w:t>
+        <w:t xml:space="preserve">python main.py </w:t>
+      </w:r>
+      <w:r>
+        <w:t>–</w:t>
+      </w:r>
+      <w:r>
+        <w:t>cli</w:t>
+      </w:r>
+      <w:r>
+        <w:tab/>
+      </w:r>
+      <w:r>
+        <w:tab/>
+      </w:r>
+      <w:r>
+        <w:t># terminal kipi (Ctrl+Q ile durdurulur)</w:t>
       </w:r>
     </w:p>
     <w:p>
@@ -24741,7 +24762,13 @@
         <w:t xml:space="preserve">    </w:t>
       </w:r>
       <w:r>
-        <w:t xml:space="preserve"> # uygulama kaynak kodu</w:t>
+        <w:t xml:space="preserve"> </w:t>
+      </w:r>
+      <w:r>
+        <w:tab/>
+      </w:r>
+      <w:r>
+        <w:t># uygulama kaynak kodu</w:t>
       </w:r>
     </w:p>
     <w:p>
@@ -24752,7 +24779,13 @@
         <w:t xml:space="preserve">  config.py          </w:t>
       </w:r>
       <w:r>
-        <w:t xml:space="preserve">   # tüm ayarlar (.env'den okunur)</w:t>
+        <w:t xml:space="preserve">   </w:t>
+      </w:r>
+      <w:r>
+        <w:tab/>
+      </w:r>
+      <w:r>
+        <w:t># tüm ayarlar (.env'den okunur)</w:t>
       </w:r>
     </w:p>
     <w:p>
@@ -24769,6 +24802,9 @@
         <w:t xml:space="preserve">  </w:t>
       </w:r>
       <w:r>
+        <w:tab/>
+      </w:r>
+      <w:r>
         <w:t># canlı kay</w:t>
       </w:r>
       <w:r>
@@ -24790,6 +24826,9 @@
       </w:r>
       <w:r>
         <w:t xml:space="preserve">  </w:t>
+      </w:r>
+      <w:r>
+        <w:tab/>
       </w:r>
       <w:r>
         <w:t># ses yakalama, VAD, ön işleme</w:t>
@@ -24851,6 +24890,9 @@
         <w:t xml:space="preserve">   </w:t>
       </w:r>
       <w:r>
+        <w:tab/>
+      </w:r>
+      <w:r>
         <w:t># transkripsiyon + ayrıştırma + takip</w:t>
       </w:r>
     </w:p>
@@ -24928,10 +24970,137 @@
         <w:t xml:space="preserve">       </w:t>
       </w:r>
       <w:r>
+        <w:t xml:space="preserve">   </w:t>
+      </w:r>
+      <w:r>
+        <w:tab/>
+      </w:r>
+      <w:r>
+        <w:t># çoklu çeviri motoru (Google/DeepL/NLLB)</w:t>
+      </w:r>
+    </w:p>
+    <w:p>
+      <w:pPr>
+        <w:shd w:val="clear" w:color="auto" w:fill="FFFFFF" w:themeFill="background1"/>
+      </w:pPr>
+      <w:r>
+        <w:t xml:space="preserve">    engine.py</w:t>
+      </w:r>
+    </w:p>
+    <w:p>
+      <w:pPr>
+        <w:shd w:val="clear" w:color="auto" w:fill="FFFFFF" w:themeFill="background1"/>
+      </w:pPr>
+      <w:r>
+        <w:t xml:space="preserve">  ui/</w:t>
+      </w:r>
+      <w:r>
+        <w:t xml:space="preserve">         </w:t>
+      </w:r>
+      <w:r>
+        <w:t xml:space="preserve">         </w:t>
+      </w:r>
+      <w:r>
+        <w:t xml:space="preserve">     </w:t>
+      </w:r>
+      <w:r>
+        <w:t xml:space="preserve"> </w:t>
+      </w:r>
+      <w:r>
+        <w:t xml:space="preserve">  </w:t>
+      </w:r>
+      <w:r>
+        <w:tab/>
+      </w:r>
+      <w:r>
+        <w:t># PySide6 arayüz (ana pencere, overlay, tepsi)</w:t>
+      </w:r>
+    </w:p>
+    <w:p>
+      <w:pPr>
+        <w:shd w:val="clear" w:color="auto" w:fill="FFFFFF" w:themeFill="background1"/>
+      </w:pPr>
+      <w:r>
+        <w:t xml:space="preserve">    </w:t>
+      </w:r>
+      <w:r>
+        <w:t>main_window.py</w:t>
+      </w:r>
+    </w:p>
+    <w:p>
+      <w:pPr>
+        <w:shd w:val="clear" w:color="auto" w:fill="FFFFFF" w:themeFill="background1"/>
+      </w:pPr>
+      <w:r>
+        <w:t xml:space="preserve">  </w:t>
+      </w:r>
+      <w:r>
+        <w:t xml:space="preserve">  </w:t>
+      </w:r>
+      <w:r>
+        <w:t>subtitle_overlay.py</w:t>
+      </w:r>
+    </w:p>
+    <w:p>
+      <w:pPr>
+        <w:shd w:val="clear" w:color="auto" w:fill="FFFFFF" w:themeFill="background1"/>
+      </w:pPr>
+      <w:r>
+        <w:t xml:space="preserve">  </w:t>
+      </w:r>
+      <w:r>
+        <w:t xml:space="preserve">  tray.py  </w:t>
+      </w:r>
+    </w:p>
+    <w:p>
+      <w:pPr>
+        <w:shd w:val="clear" w:color="auto" w:fill="FFFFFF" w:themeFill="background1"/>
+      </w:pPr>
+      <w:r>
+        <w:t xml:space="preserve">    </w:t>
+      </w:r>
+      <w:r>
+        <w:t>resources.py</w:t>
+      </w:r>
+    </w:p>
+    <w:p>
+      <w:pPr>
+        <w:shd w:val="clear" w:color="auto" w:fill="FFFFFF" w:themeFill="background1"/>
+      </w:pPr>
+      <w:r>
+        <w:t xml:space="preserve">  model_folder/  </w:t>
+      </w:r>
+      <w:r>
+        <w:t xml:space="preserve">   </w:t>
+      </w:r>
+      <w:r>
+        <w:t xml:space="preserve">   </w:t>
+      </w:r>
+      <w:r>
+        <w:tab/>
+      </w:r>
+      <w:r>
+        <w:t># veri şemaları, konuşmacı renk paleti</w:t>
+      </w:r>
+    </w:p>
+    <w:p>
+      <w:pPr>
+        <w:shd w:val="clear" w:color="auto" w:fill="FFFFFF" w:themeFill="background1"/>
+      </w:pPr>
+      <w:r>
+        <w:t xml:space="preserve">tests/        </w:t>
+      </w:r>
+      <w:r>
+        <w:t xml:space="preserve">         </w:t>
+      </w:r>
+      <w:r>
         <w:t xml:space="preserve">       </w:t>
       </w:r>
       <w:r>
-        <w:t># çoklu çeviri motoru (Google/DeepL/NLLB)</w:t>
+        <w:tab/>
+      </w:r>
+      <w:r>
+        <w:t># değerlendirme, benchmark ve birim testler</w:t>
       </w:r>
     </w:p>
     <w:p>
@@ -24939,7 +25108,19 @@
         <w:shd w:val="clear" w:color="auto" w:fill="FFFFFF" w:themeFill="background1"/>
       </w:pPr>
       <w:r>
-        <w:t xml:space="preserve">    engine.py</w:t>
+        <w:t xml:space="preserve">  unit/    </w:t>
+      </w:r>
+      <w:r>
+        <w:t xml:space="preserve">             </w:t>
+      </w:r>
+      <w:r>
+        <w:t xml:space="preserve">      </w:t>
+      </w:r>
+      <w:r>
+        <w:tab/>
+      </w:r>
+      <w:r>
+        <w:t># hızlı pytest birim testleri</w:t>
       </w:r>
     </w:p>
     <w:p>
@@ -24947,250 +25128,138 @@
         <w:shd w:val="clear" w:color="auto" w:fill="FFFFFF" w:themeFill="background1"/>
       </w:pPr>
       <w:r>
-        <w:t xml:space="preserve">  ui/</w:t>
+        <w:t xml:space="preserve">  dataset_managers/  </w:t>
+      </w:r>
+      <w:r>
+        <w:tab/>
+      </w:r>
+      <w:r>
+        <w:t># veri seti indirme/yükleme (dataset başına 1 dosya)</w:t>
+      </w:r>
+    </w:p>
+    <w:p>
+      <w:pPr>
+        <w:shd w:val="clear" w:color="auto" w:fill="FFFFFF" w:themeFill="background1"/>
+      </w:pPr>
+      <w:r>
+        <w:t xml:space="preserve">  metrics/         </w:t>
+      </w:r>
+      <w:r>
+        <w:t xml:space="preserve">     </w:t>
+      </w:r>
+      <w:r>
+        <w:t xml:space="preserve">   </w:t>
+      </w:r>
+      <w:r>
+        <w:tab/>
+      </w:r>
+      <w:r>
+        <w:t># tüm metrik matematiği (WER/CER/DER/cpWER/BLEU/chrF/COMET)</w:t>
+      </w:r>
+    </w:p>
+    <w:p>
+      <w:pPr>
+        <w:shd w:val="clear" w:color="auto" w:fill="FFFFFF" w:themeFill="background1"/>
+      </w:pPr>
+      <w:r>
+        <w:t xml:space="preserve">  benchmarks/    </w:t>
+      </w:r>
+      <w:r>
+        <w:t xml:space="preserve">     </w:t>
+      </w:r>
+      <w:r>
+        <w:tab/>
+      </w:r>
+      <w:r>
+        <w:t># ağır runner'lar (librispeech, ami, chime6, translation)</w:t>
+      </w:r>
+    </w:p>
+    <w:p>
+      <w:pPr>
+        <w:shd w:val="clear" w:color="auto" w:fill="FFFFFF" w:themeFill="background1"/>
+      </w:pPr>
+      <w:r>
+        <w:t xml:space="preserve">scripts/      </w:t>
+      </w:r>
+      <w:r>
+        <w:t xml:space="preserve">          </w:t>
+      </w:r>
+      <w:r>
+        <w:t xml:space="preserve">    </w:t>
+      </w:r>
+      <w:r>
+        <w:tab/>
+      </w:r>
+      <w:r>
+        <w:t># betikler (download_models, vad_sweep, run_gss)</w:t>
+      </w:r>
+    </w:p>
+    <w:p>
+      <w:pPr>
+        <w:shd w:val="clear" w:color="auto" w:fill="FFFFFF" w:themeFill="background1"/>
+      </w:pPr>
+      <w:r>
+        <w:t xml:space="preserve">datasets/  </w:t>
+      </w:r>
+      <w:r>
+        <w:t xml:space="preserve">             </w:t>
+      </w:r>
+      <w:r>
+        <w:t xml:space="preserve">   </w:t>
+      </w:r>
+      <w:r>
+        <w:tab/>
+      </w:r>
+      <w:r>
+        <w:t xml:space="preserve"># veri kümeleri (ami, chime6, flores200, librispeech) </w:t>
+      </w:r>
+    </w:p>
+    <w:p>
+      <w:pPr>
+        <w:shd w:val="clear" w:color="auto" w:fill="FFFFFF" w:themeFill="background1"/>
+      </w:pPr>
+      <w:r>
+        <w:t>gitignore</w:t>
+      </w:r>
+    </w:p>
+    <w:p>
+      <w:pPr>
+        <w:shd w:val="clear" w:color="auto" w:fill="FFFFFF" w:themeFill="background1"/>
+      </w:pPr>
+      <w:r>
+        <w:t xml:space="preserve">models/      </w:t>
+      </w:r>
+      <w:r>
+        <w:t xml:space="preserve">          </w:t>
+      </w:r>
+      <w:r>
+        <w:t xml:space="preserve">   </w:t>
+      </w:r>
+      <w:r>
+        <w:tab/>
+      </w:r>
+      <w:r>
+        <w:t xml:space="preserve"># yerel AI modelleri </w:t>
+      </w:r>
+    </w:p>
+    <w:p>
+      <w:pPr>
+        <w:shd w:val="clear" w:color="auto" w:fill="FFFFFF" w:themeFill="background1"/>
+      </w:pPr>
+      <w:r>
+        <w:t xml:space="preserve">output/   </w:t>
       </w:r>
       <w:r>
         <w:t xml:space="preserve">         </w:t>
       </w:r>
       <w:r>
-        <w:t xml:space="preserve">         </w:t>
-      </w:r>
-      <w:r>
         <w:t xml:space="preserve">     </w:t>
       </w:r>
       <w:r>
         <w:t xml:space="preserve"> </w:t>
       </w:r>
       <w:r>
-        <w:t xml:space="preserve">       </w:t>
-      </w:r>
-      <w:r>
-        <w:t># PySide6 arayüz (ana pencere, overlay, tepsi)</w:t>
-      </w:r>
-    </w:p>
-    <w:p>
-      <w:pPr>
-        <w:shd w:val="clear" w:color="auto" w:fill="FFFFFF" w:themeFill="background1"/>
-      </w:pPr>
-      <w:r>
-        <w:t xml:space="preserve">    </w:t>
-      </w:r>
-      <w:r>
-        <w:t>main_window.py</w:t>
-      </w:r>
-    </w:p>
-    <w:p>
-      <w:pPr>
-        <w:shd w:val="clear" w:color="auto" w:fill="FFFFFF" w:themeFill="background1"/>
-      </w:pPr>
-      <w:r>
-        <w:t xml:space="preserve">  </w:t>
-      </w:r>
-      <w:r>
-        <w:t xml:space="preserve">  </w:t>
-      </w:r>
-      <w:r>
-        <w:t>subtitle_overlay.py</w:t>
-      </w:r>
-    </w:p>
-    <w:p>
-      <w:pPr>
-        <w:shd w:val="clear" w:color="auto" w:fill="FFFFFF" w:themeFill="background1"/>
-      </w:pPr>
-      <w:r>
-        <w:t xml:space="preserve">  </w:t>
-      </w:r>
-      <w:r>
-        <w:t xml:space="preserve">  tray.py  </w:t>
-      </w:r>
-    </w:p>
-    <w:p>
-      <w:pPr>
-        <w:shd w:val="clear" w:color="auto" w:fill="FFFFFF" w:themeFill="background1"/>
-      </w:pPr>
-      <w:r>
-        <w:t xml:space="preserve">    </w:t>
-      </w:r>
-      <w:r>
-        <w:t>resources.py</w:t>
-      </w:r>
-    </w:p>
-    <w:p>
-      <w:pPr>
-        <w:shd w:val="clear" w:color="auto" w:fill="FFFFFF" w:themeFill="background1"/>
-      </w:pPr>
-      <w:r>
-        <w:t xml:space="preserve">  model_folder/  </w:t>
-      </w:r>
-      <w:r>
-        <w:t xml:space="preserve">   </w:t>
-      </w:r>
-      <w:r>
-        <w:t xml:space="preserve">       </w:t>
-      </w:r>
-      <w:r>
-        <w:t># veri şemaları, konuşmacı renk paleti</w:t>
-      </w:r>
-    </w:p>
-    <w:p>
-      <w:pPr>
-        <w:shd w:val="clear" w:color="auto" w:fill="FFFFFF" w:themeFill="background1"/>
-      </w:pPr>
-      <w:r>
-        <w:t xml:space="preserve">tests/        </w:t>
-      </w:r>
-      <w:r>
-        <w:t xml:space="preserve">         </w:t>
-      </w:r>
-      <w:r>
-        <w:t xml:space="preserve">          </w:t>
-      </w:r>
-      <w:r>
-        <w:t xml:space="preserve"> # değerlendirme, benchmark ve birim testler</w:t>
-      </w:r>
-    </w:p>
-    <w:p>
-      <w:pPr>
-        <w:shd w:val="clear" w:color="auto" w:fill="FFFFFF" w:themeFill="background1"/>
-      </w:pPr>
-      <w:r>
-        <w:t xml:space="preserve">  unit/    </w:t>
-      </w:r>
-      <w:r>
-        <w:t xml:space="preserve">             </w:t>
-      </w:r>
-      <w:r>
-        <w:t xml:space="preserve">          </w:t>
-      </w:r>
-      <w:r>
-        <w:t># hızlı pytest birim testleri</w:t>
-      </w:r>
-    </w:p>
-    <w:p>
-      <w:pPr>
-        <w:shd w:val="clear" w:color="auto" w:fill="FFFFFF" w:themeFill="background1"/>
-      </w:pPr>
-      <w:r>
-        <w:t xml:space="preserve">  dataset_managers/   </w:t>
-      </w:r>
-      <w:r>
-        <w:t xml:space="preserve">  </w:t>
-      </w:r>
-      <w:r>
-        <w:t># veri seti indirme/yükleme (dataset başına 1 dosya)</w:t>
-      </w:r>
-    </w:p>
-    <w:p>
-      <w:pPr>
-        <w:shd w:val="clear" w:color="auto" w:fill="FFFFFF" w:themeFill="background1"/>
-      </w:pPr>
-      <w:r>
-        <w:t xml:space="preserve">  metrics/         </w:t>
-      </w:r>
-      <w:r>
-        <w:t xml:space="preserve">     </w:t>
-      </w:r>
-      <w:r>
-        <w:t xml:space="preserve">       </w:t>
-      </w:r>
-      <w:r>
-        <w:t># tüm metrik matematiği (WER/CER/DER/cpWER/BLEU/chrF/COMET)</w:t>
-      </w:r>
-    </w:p>
-    <w:p>
-      <w:pPr>
-        <w:shd w:val="clear" w:color="auto" w:fill="FFFFFF" w:themeFill="background1"/>
-      </w:pPr>
-      <w:r>
-        <w:t xml:space="preserve">  benchmarks/    </w:t>
-      </w:r>
-      <w:r>
-        <w:t xml:space="preserve">       </w:t>
-      </w:r>
-      <w:r>
-        <w:t xml:space="preserve">  </w:t>
-      </w:r>
-      <w:r>
-        <w:t># ağır runner'lar (librispeech, ami, chime6, translation)</w:t>
-      </w:r>
-    </w:p>
-    <w:p>
-      <w:pPr>
-        <w:shd w:val="clear" w:color="auto" w:fill="FFFFFF" w:themeFill="background1"/>
-      </w:pPr>
-      <w:r>
-        <w:t xml:space="preserve">scripts/      </w:t>
-      </w:r>
-      <w:r>
-        <w:t xml:space="preserve">          </w:t>
-      </w:r>
-      <w:r>
-        <w:t xml:space="preserve">        </w:t>
-      </w:r>
-      <w:r>
-        <w:t># betikler (download_models, vad_sweep, run_gss)</w:t>
-      </w:r>
-    </w:p>
-    <w:p>
-      <w:pPr>
-        <w:shd w:val="clear" w:color="auto" w:fill="FFFFFF" w:themeFill="background1"/>
-      </w:pPr>
-      <w:r>
-        <w:t xml:space="preserve">datasets/  </w:t>
-      </w:r>
-      <w:r>
-        <w:t xml:space="preserve">             </w:t>
-      </w:r>
-      <w:r>
-        <w:t xml:space="preserve">      </w:t>
-      </w:r>
-      <w:r>
-        <w:t xml:space="preserve"># veri kümeleri (ami, chime6, flores200, librispeech) </w:t>
-      </w:r>
-    </w:p>
-    <w:p>
-      <w:pPr>
-        <w:shd w:val="clear" w:color="auto" w:fill="FFFFFF" w:themeFill="background1"/>
-      </w:pPr>
-      <w:r>
-        <w:t>gitignore</w:t>
-      </w:r>
-    </w:p>
-    <w:p>
-      <w:pPr>
-        <w:shd w:val="clear" w:color="auto" w:fill="FFFFFF" w:themeFill="background1"/>
-      </w:pPr>
-      <w:r>
-        <w:t xml:space="preserve">models/      </w:t>
-      </w:r>
-      <w:r>
-        <w:t xml:space="preserve">          </w:t>
-      </w:r>
-      <w:r>
-        <w:t xml:space="preserve">     </w:t>
-      </w:r>
-      <w:r>
-        <w:t xml:space="preserve"> # yerel AI modelleri </w:t>
-      </w:r>
-    </w:p>
-    <w:p>
-      <w:pPr>
-        <w:shd w:val="clear" w:color="auto" w:fill="FFFFFF" w:themeFill="background1"/>
-      </w:pPr>
-      <w:r>
-        <w:t xml:space="preserve">output/   </w:t>
-      </w:r>
-      <w:r>
-        <w:t xml:space="preserve">         </w:t>
-      </w:r>
-      <w:r>
-        <w:t xml:space="preserve">     </w:t>
-      </w:r>
-      <w:r>
-        <w:t xml:space="preserve">     </w:t>
-      </w:r>
-      <w:r>
-        <w:t xml:space="preserve"> </w:t>
+        <w:tab/>
       </w:r>
       <w:r>
         <w:t xml:space="preserve"># çıktı ve ölçüm dosyaları </w:t>
@@ -25241,7 +25310,13 @@
         <w:t xml:space="preserve">           </w:t>
       </w:r>
       <w:r>
-        <w:t xml:space="preserve"> # hızlı birim testler</w:t>
+        <w:t xml:space="preserve"> </w:t>
+      </w:r>
+      <w:r>
+        <w:tab/>
+      </w:r>
+      <w:r>
+        <w:t># hızlı birim testler</w:t>
       </w:r>
     </w:p>
     <w:p>
@@ -25255,7 +25330,13 @@
         <w:t xml:space="preserve">      </w:t>
       </w:r>
       <w:r>
-        <w:t xml:space="preserve"> # tüm veri kümelerini indir</w:t>
+        <w:t xml:space="preserve"> </w:t>
+      </w:r>
+      <w:r>
+        <w:tab/>
+      </w:r>
+      <w:r>
+        <w:t># tüm veri kümelerini indir</w:t>
       </w:r>
     </w:p>
     <w:p>
@@ -25263,7 +25344,13 @@
         <w:shd w:val="clear" w:color="auto" w:fill="FFFFFF" w:themeFill="background1"/>
       </w:pPr>
       <w:r>
-        <w:t>python -m tests.dataset_managers flores200  # tek veri kümesi</w:t>
+        <w:t xml:space="preserve">python -m tests.dataset_managers flores200  </w:t>
+      </w:r>
+      <w:r>
+        <w:tab/>
+      </w:r>
+      <w:r>
+        <w:t># tek veri kümesi</w:t>
       </w:r>
     </w:p>
     <w:p>

</xml_diff>